<commit_message>
docs: GitHub Desktop 온라인 인계 절차 추가
</commit_message>
<xml_diff>
--- a/docs/github-study.docx
+++ b/docs/github-study.docx
@@ -114,7 +114,22 @@
           <w:b/>
           <w:lang w:eastAsia="ko-KR"/>
         </w:rPr>
-        <w:t>토요일에 아무것도 보지 않고, 연습 저장소에서 「브랜치 만들기 → 수정 → 커밋 → Push → PR → 병합」을 혼자 할 수 있으면 준비가 끝난 것입니다.</w:t>
+        <w:t>토요일에 아무것도 보지 않고, 연습 저장소에서 「브랜치 만들기 → 수정 → 커밋 → Push → PR</w:t>
+      </w:r>
+      <w:r>
+        <w:rPr>
+          <w:rFonts w:hint="eastAsia"/>
+          <w:b/>
+          <w:lang w:eastAsia="ko-KR"/>
+        </w:rPr>
+        <w:t>(Pull Request)</w:t>
+      </w:r>
+      <w:r>
+        <w:rPr>
+          <w:b/>
+          <w:lang w:eastAsia="ko-KR"/>
+        </w:rPr>
+        <w:t xml:space="preserve"> → 병합」을 혼자 할 수 있으면 준비가 끝난 것입니다.</w:t>
       </w:r>
     </w:p>
     <w:p>
@@ -205,13 +220,41 @@
           <w:b/>
           <w:lang w:eastAsia="ko-KR"/>
         </w:rPr>
+        <w:t xml:space="preserve">GitHub </w:t>
+      </w:r>
+      <w:proofErr w:type="spellStart"/>
+      <w:r>
+        <w:rPr>
+          <w:b/>
+          <w:lang w:eastAsia="ko-KR"/>
+        </w:rPr>
+        <w:t>GitHub</w:t>
+      </w:r>
+      <w:proofErr w:type="spellEnd"/>
+      <w:r>
+        <w:rPr>
+          <w:b/>
+          <w:lang w:eastAsia="ko-KR"/>
+        </w:rPr>
+        <w:t xml:space="preserve"> Desktop</w:t>
+      </w:r>
+      <w:r>
+        <w:rPr>
+          <w:lang w:eastAsia="ko-KR"/>
+        </w:rPr>
+        <w:t>을 설치합니다: https://</w:t>
+      </w:r>
+      <w:r>
+        <w:rPr>
+          <w:lang w:eastAsia="ko-KR"/>
+        </w:rPr>
         <w:t>GitHub Desktop</w:t>
       </w:r>
       <w:r>
         <w:rPr>
           <w:lang w:eastAsia="ko-KR"/>
         </w:rPr>
-        <w:t>을 설치합니다: https://desktop.github.com</w:t>
+        <w:t>.github.com</w:t>
       </w:r>
     </w:p>
     <w:p>
@@ -467,6 +510,7 @@
           <w:p>
             <w:pPr>
               <w:rPr>
+                <w:rFonts w:hint="eastAsia"/>
                 <w:lang w:eastAsia="ko-KR"/>
               </w:rPr>
             </w:pPr>
@@ -474,7 +518,14 @@
               <w:rPr>
                 <w:lang w:eastAsia="ko-KR"/>
               </w:rPr>
-              <w:t>내 브랜치를 main에 합쳐 달라는 요청입니다. 합치기 전에 리뷰를 받습니다.</w:t>
+              <w:t>내 브랜치를 main에 합쳐 달라는 요청입니다. 합치기</w:t>
+            </w:r>
+            <w:r>
+              <w:rPr>
+                <w:rFonts w:hint="eastAsia"/>
+                <w:lang w:eastAsia="ko-KR"/>
+              </w:rPr>
+              <w:t xml:space="preserve"> 전에는 올리고 있는 사람이 점검도 가능합니다.</w:t>
             </w:r>
           </w:p>
         </w:tc>
@@ -738,39 +789,23 @@
       <w:r>
         <w:t xml:space="preserve">를 선택하고, </w:t>
       </w:r>
-      <w:proofErr w:type="gramStart"/>
       <w:r>
         <w:rPr>
           <w:b/>
         </w:rPr>
-        <w:t>Add</w:t>
-      </w:r>
-      <w:proofErr w:type="gramEnd"/>
+        <w:t>Add a README file</w:t>
+      </w:r>
+      <w:r>
+        <w:t xml:space="preserve">에 체크한 뒤 </w:t>
+      </w:r>
       <w:r>
         <w:rPr>
           <w:b/>
         </w:rPr>
-        <w:t xml:space="preserve"> a README file</w:t>
-      </w:r>
-      <w:r>
-        <w:t xml:space="preserve">에 체크한 뒤 </w:t>
-      </w:r>
-      <w:r>
-        <w:rPr>
-          <w:b/>
-        </w:rPr>
         <w:t>Create repository</w:t>
       </w:r>
       <w:r>
-        <w:t xml:space="preserve"> 버튼을 </w:t>
-      </w:r>
-      <w:proofErr w:type="gramStart"/>
-      <w:r>
-        <w:t>누릅니다(</w:t>
-      </w:r>
-      <w:proofErr w:type="gramEnd"/>
-      <w:r>
-        <w:t>그림 2).</w:t>
+        <w:t xml:space="preserve"> 버튼을 누릅니다(그림 2).</w:t>
       </w:r>
     </w:p>
     <w:p>
@@ -867,7 +902,23 @@
           <w:b/>
           <w:lang w:eastAsia="ko-KR"/>
         </w:rPr>
-        <w:t>Open with GitHub Desktop</w:t>
+        <w:t xml:space="preserve">Open with GitHub </w:t>
+      </w:r>
+      <w:proofErr w:type="spellStart"/>
+      <w:r>
+        <w:rPr>
+          <w:b/>
+          <w:lang w:eastAsia="ko-KR"/>
+        </w:rPr>
+        <w:t>GitHub</w:t>
+      </w:r>
+      <w:proofErr w:type="spellEnd"/>
+      <w:r>
+        <w:rPr>
+          <w:b/>
+          <w:lang w:eastAsia="ko-KR"/>
+        </w:rPr>
+        <w:t xml:space="preserve"> Desktop</w:t>
       </w:r>
       <w:r>
         <w:rPr>
@@ -886,21 +937,7 @@
         <w:rPr>
           <w:lang w:eastAsia="ko-KR"/>
         </w:rPr>
-        <w:t xml:space="preserve"> 순서로 누르면 저장소가 내 PC로 </w:t>
-      </w:r>
-      <w:proofErr w:type="gramStart"/>
-      <w:r>
-        <w:rPr>
-          <w:lang w:eastAsia="ko-KR"/>
-        </w:rPr>
-        <w:t>복사됩니다(</w:t>
-      </w:r>
-      <w:proofErr w:type="gramEnd"/>
-      <w:r>
-        <w:rPr>
-          <w:lang w:eastAsia="ko-KR"/>
-        </w:rPr>
-        <w:t>그림 3).</w:t>
+        <w:t xml:space="preserve"> 순서로 누르면 저장소가 내 PC로 복사됩니다(그림 3).</w:t>
       </w:r>
     </w:p>
     <w:p>
@@ -978,7 +1015,27 @@
           <w:lang w:eastAsia="ko-KR"/>
         </w:rPr>
         <w:lastRenderedPageBreak/>
-        <w:t xml:space="preserve">4.  GitHub Desktop 상단의 세 구역 위치를 눈에 익힙니다. 앞으로 매일 보는 곳이며, 특히 가운데 </w:t>
+        <w:t xml:space="preserve">4.  GitHub </w:t>
+      </w:r>
+      <w:proofErr w:type="spellStart"/>
+      <w:r>
+        <w:rPr>
+          <w:lang w:eastAsia="ko-KR"/>
+        </w:rPr>
+        <w:t>GitHub</w:t>
+      </w:r>
+      <w:proofErr w:type="spellEnd"/>
+      <w:r>
+        <w:rPr>
+          <w:lang w:eastAsia="ko-KR"/>
+        </w:rPr>
+        <w:t xml:space="preserve"> Desktop</w:t>
+      </w:r>
+      <w:r>
+        <w:rPr>
+          <w:lang w:eastAsia="ko-KR"/>
+        </w:rPr>
+        <w:t xml:space="preserve"> 상단의 세 구역 위치를 눈에 익힙니다. 앞으로 매일 보는 곳이며, 특히 가운데 </w:t>
       </w:r>
       <w:r>
         <w:rPr>
@@ -1053,7 +1110,33 @@
           <w:sz w:val="18"/>
           <w:lang w:eastAsia="ko-KR"/>
         </w:rPr>
-        <w:t>그림 4.  GitHub Desktop 상단 — 항상 확인하는 세 구역</w:t>
+        <w:t xml:space="preserve">그림 4.  GitHub </w:t>
+      </w:r>
+      <w:proofErr w:type="spellStart"/>
+      <w:r>
+        <w:rPr>
+          <w:color w:val="59636E"/>
+          <w:sz w:val="18"/>
+          <w:lang w:eastAsia="ko-KR"/>
+        </w:rPr>
+        <w:t>GitHub</w:t>
+      </w:r>
+      <w:proofErr w:type="spellEnd"/>
+      <w:r>
+        <w:rPr>
+          <w:color w:val="59636E"/>
+          <w:sz w:val="18"/>
+          <w:lang w:eastAsia="ko-KR"/>
+        </w:rPr>
+        <w:t xml:space="preserve"> Desktop</w:t>
+      </w:r>
+      <w:r>
+        <w:rPr>
+          <w:color w:val="59636E"/>
+          <w:sz w:val="18"/>
+          <w:lang w:eastAsia="ko-KR"/>
+        </w:rPr>
+        <w:t xml:space="preserve"> 상단 — 항상 확인하는 세 구역</w:t>
       </w:r>
     </w:p>
     <w:p>
@@ -1196,7 +1279,19 @@
         <w:rPr>
           <w:lang w:eastAsia="ko-KR"/>
         </w:rPr>
-        <w:t xml:space="preserve">1.  Desktop의 </w:t>
+        <w:t xml:space="preserve">1.  </w:t>
+      </w:r>
+      <w:r>
+        <w:rPr>
+          <w:lang w:eastAsia="ko-KR"/>
+        </w:rPr>
+        <w:t>GitHub Desktop</w:t>
+      </w:r>
+      <w:r>
+        <w:rPr>
+          <w:lang w:eastAsia="ko-KR"/>
+        </w:rPr>
+        <w:t xml:space="preserve">의 </w:t>
       </w:r>
       <w:r>
         <w:rPr>
@@ -1237,7 +1332,19 @@
         <w:rPr>
           <w:lang w:eastAsia="ko-KR"/>
         </w:rPr>
-        <w:t xml:space="preserve">2.  Desktop으로 돌아오면 왼쪽 </w:t>
+        <w:t xml:space="preserve">2.  </w:t>
+      </w:r>
+      <w:r>
+        <w:rPr>
+          <w:lang w:eastAsia="ko-KR"/>
+        </w:rPr>
+        <w:t>GitHub Desktop</w:t>
+      </w:r>
+      <w:r>
+        <w:rPr>
+          <w:lang w:eastAsia="ko-KR"/>
+        </w:rPr>
+        <w:t xml:space="preserve">으로 돌아오면 왼쪽 </w:t>
       </w:r>
       <w:r>
         <w:rPr>
@@ -1334,35 +1441,7 @@
         <w:rPr>
           <w:lang w:eastAsia="ko-KR"/>
         </w:rPr>
-        <w:t xml:space="preserve">5.  새 </w:t>
-      </w:r>
-      <w:proofErr w:type="gramStart"/>
-      <w:r>
-        <w:rPr>
-          <w:lang w:eastAsia="ko-KR"/>
-        </w:rPr>
-        <w:t>파일(</w:t>
-      </w:r>
-      <w:proofErr w:type="gramEnd"/>
-      <w:r>
-        <w:rPr>
-          <w:lang w:eastAsia="ko-KR"/>
-        </w:rPr>
-        <w:t xml:space="preserve">memo.md </w:t>
-      </w:r>
-      <w:proofErr w:type="gramStart"/>
-      <w:r>
-        <w:rPr>
-          <w:lang w:eastAsia="ko-KR"/>
-        </w:rPr>
-        <w:t>등)을</w:t>
-      </w:r>
-      <w:proofErr w:type="gramEnd"/>
-      <w:r>
-        <w:rPr>
-          <w:lang w:eastAsia="ko-KR"/>
-        </w:rPr>
-        <w:t xml:space="preserve"> 만들어 같은 과정을 한 번 더 반복합니다.</w:t>
+        <w:t>5.  새 파일(memo.md 등)을 만들어 같은 과정을 한 번 더 반복합니다.</w:t>
       </w:r>
     </w:p>
     <w:p>
@@ -1877,50 +1956,27 @@
           <w:lang w:eastAsia="ko-KR"/>
         </w:rPr>
         <w:lastRenderedPageBreak/>
-        <w:t>6</w:t>
-      </w:r>
-      <w:proofErr w:type="gramStart"/>
-      <w:r>
-        <w:rPr>
-          <w:lang w:eastAsia="ko-KR"/>
-        </w:rPr>
-        <w:t xml:space="preserve">.  </w:t>
+        <w:t>6.</w:t>
+      </w:r>
+      <w:r>
+        <w:rPr>
+          <w:rFonts w:hint="eastAsia"/>
+          <w:lang w:eastAsia="ko-KR"/>
+        </w:rPr>
+        <w:t xml:space="preserve"> </w:t>
       </w:r>
       <w:r>
         <w:rPr>
           <w:b/>
           <w:lang w:eastAsia="ko-KR"/>
         </w:rPr>
-        <w:t>Merge</w:t>
-      </w:r>
-      <w:proofErr w:type="gramEnd"/>
-      <w:r>
-        <w:rPr>
-          <w:b/>
-          <w:lang w:eastAsia="ko-KR"/>
-        </w:rPr>
-        <w:t xml:space="preserve"> pull </w:t>
-      </w:r>
-      <w:proofErr w:type="gramStart"/>
-      <w:r>
-        <w:rPr>
-          <w:b/>
-          <w:lang w:eastAsia="ko-KR"/>
-        </w:rPr>
-        <w:t>request</w:t>
-      </w:r>
-      <w:r>
-        <w:rPr>
-          <w:lang w:eastAsia="ko-KR"/>
-        </w:rPr>
-        <w:t xml:space="preserve"> →</w:t>
-      </w:r>
-      <w:proofErr w:type="gramEnd"/>
-      <w:r>
-        <w:rPr>
-          <w:lang w:eastAsia="ko-KR"/>
-        </w:rPr>
-        <w:t xml:space="preserve"> </w:t>
+        <w:t>Merge pull request</w:t>
+      </w:r>
+      <w:r>
+        <w:rPr>
+          <w:lang w:eastAsia="ko-KR"/>
+        </w:rPr>
+        <w:t xml:space="preserve"> → </w:t>
       </w:r>
       <w:r>
         <w:rPr>
@@ -1961,7 +2017,19 @@
         <w:rPr>
           <w:lang w:eastAsia="ko-KR"/>
         </w:rPr>
-        <w:t xml:space="preserve">7.  Desktop으로 돌아와 </w:t>
+        <w:t xml:space="preserve">7.  </w:t>
+      </w:r>
+      <w:r>
+        <w:rPr>
+          <w:lang w:eastAsia="ko-KR"/>
+        </w:rPr>
+        <w:t>GitHub Desktop</w:t>
+      </w:r>
+      <w:r>
+        <w:rPr>
+          <w:lang w:eastAsia="ko-KR"/>
+        </w:rPr>
+        <w:t xml:space="preserve">으로 돌아와 </w:t>
       </w:r>
       <w:r>
         <w:rPr>
@@ -1974,7 +2042,34 @@
         <w:rPr>
           <w:lang w:eastAsia="ko-KR"/>
         </w:rPr>
-        <w:t xml:space="preserve">에서 main을 선택하고 </w:t>
+        <w:t>에서 main을 선택하고</w:t>
+      </w:r>
+      <w:r>
+        <w:rPr>
+          <w:rFonts w:hint="eastAsia"/>
+          <w:lang w:eastAsia="ko-KR"/>
+        </w:rPr>
+        <w:t xml:space="preserve"> </w:t>
+      </w:r>
+      <w:r>
+        <w:rPr>
+          <w:rFonts w:hint="eastAsia"/>
+          <w:lang w:eastAsia="ko-KR"/>
+        </w:rPr>
+        <w:t>fetch origin을 눌러</w:t>
+      </w:r>
+      <w:r>
+        <w:rPr>
+          <w:rFonts w:hint="eastAsia"/>
+          <w:lang w:eastAsia="ko-KR"/>
+        </w:rPr>
+        <w:t xml:space="preserve"> 새로고침한 뒤</w:t>
+      </w:r>
+      <w:r>
+        <w:rPr>
+          <w:lang w:eastAsia="ko-KR"/>
+        </w:rPr>
+        <w:t xml:space="preserve"> </w:t>
       </w:r>
       <w:r>
         <w:rPr>
@@ -2109,7 +2204,7 @@
       <w:pPr>
         <w:pStyle w:val="Heading1"/>
         <w:rPr>
-          <w:rFonts w:eastAsia="Malgun Gothic" w:hint="eastAsia"/>
+          <w:rFonts w:eastAsia="Malgun Gothic"/>
           <w:lang w:eastAsia="ko-KR"/>
         </w:rPr>
       </w:pPr>
@@ -2142,10 +2237,7 @@
         <w:rPr>
           <w:lang w:eastAsia="ko-KR"/>
         </w:rPr>
-        <w:t xml:space="preserve"> </w:t>
-      </w:r>
-      <w:r>
-        <w:t>—</w:t>
+        <w:t xml:space="preserve"> —</w:t>
       </w:r>
     </w:p>
     <w:p>
@@ -2317,19 +2409,11 @@
           <w:lang w:eastAsia="ko-KR"/>
         </w:rPr>
       </w:pPr>
-      <w:proofErr w:type="gramStart"/>
-      <w:r>
-        <w:rPr>
-          <w:lang w:eastAsia="ko-KR"/>
-        </w:rPr>
-        <w:t>□  1</w:t>
-      </w:r>
-      <w:proofErr w:type="gramEnd"/>
-      <w:r>
-        <w:rPr>
-          <w:lang w:eastAsia="ko-KR"/>
-        </w:rPr>
-        <w:t>. 앉으면 하는 루틴 4단계를 말할 수 있다 (Fetch → main 확인 → Pull → New Branch)</w:t>
+      <w:r>
+        <w:rPr>
+          <w:lang w:eastAsia="ko-KR"/>
+        </w:rPr>
+        <w:t>□  1. 앉으면 하는 루틴 4단계를 말할 수 있다 (Fetch → main 확인 → Pull → New Branch)</w:t>
       </w:r>
     </w:p>
     <w:p>
@@ -2340,19 +2424,11 @@
           <w:lang w:eastAsia="ko-KR"/>
         </w:rPr>
       </w:pPr>
-      <w:proofErr w:type="gramStart"/>
-      <w:r>
-        <w:rPr>
-          <w:lang w:eastAsia="ko-KR"/>
-        </w:rPr>
-        <w:t>□  2</w:t>
-      </w:r>
-      <w:proofErr w:type="gramEnd"/>
-      <w:r>
-        <w:rPr>
-          <w:lang w:eastAsia="ko-KR"/>
-        </w:rPr>
-        <w:t>. 커밋 메시지 형식 「영역: 한 줄 요약」을 알고 예를 하나 들 수 있다</w:t>
+      <w:r>
+        <w:rPr>
+          <w:lang w:eastAsia="ko-KR"/>
+        </w:rPr>
+        <w:t>□  2. 커밋 메시지 형식 「영역: 한 줄 요약」을 알고 예를 하나 들 수 있다</w:t>
       </w:r>
     </w:p>
     <w:p>
@@ -2363,19 +2439,11 @@
           <w:lang w:eastAsia="ko-KR"/>
         </w:rPr>
       </w:pPr>
-      <w:proofErr w:type="gramStart"/>
-      <w:r>
-        <w:rPr>
-          <w:lang w:eastAsia="ko-KR"/>
-        </w:rPr>
-        <w:t>□  3</w:t>
-      </w:r>
-      <w:proofErr w:type="gramEnd"/>
-      <w:r>
-        <w:rPr>
-          <w:lang w:eastAsia="ko-KR"/>
-        </w:rPr>
-        <w:t>. 연습 저장소에서 브랜치 → 수정 → 커밋 → PR → 병합을 5분 안에 혼자 할 수 있다</w:t>
+      <w:r>
+        <w:rPr>
+          <w:lang w:eastAsia="ko-KR"/>
+        </w:rPr>
+        <w:t>□  3. 연습 저장소에서 브랜치 → 수정 → 커밋 → PR → 병합을 5분 안에 혼자 할 수 있다</w:t>
       </w:r>
     </w:p>
     <w:p>
@@ -2383,13 +2451,8 @@
         <w:spacing w:after="160"/>
         <w:ind w:left="227"/>
       </w:pPr>
-      <w:proofErr w:type="gramStart"/>
-      <w:r>
-        <w:t>□  4</w:t>
-      </w:r>
-      <w:proofErr w:type="gramEnd"/>
-      <w:r>
-        <w:t>. 실수 수습 버튼 3개(Discard Changes / Undo / Revert Changes in Commit)가 어디 있는지 안다</w:t>
+      <w:r>
+        <w:t>□  4. 실수 수습 버튼 3개(Discard Changes / Undo / Revert Changes in Commit)가 어디 있는지 안다</w:t>
       </w:r>
     </w:p>
     <w:p>

</xml_diff>